<commit_message>
Toan TSA 04: prefill one 90° blank in Q7, drop cumulative column in Q38
Co-Authored-By: Claude Opus 5.5 <noreply@anthropic.com>
Claude-Session: https://claude.ai/code/session_011biUhq93pnYnrTygYCggN2
</commit_message>
<xml_diff>
--- a/Toan_TSA_04_interedu.docx
+++ b/Toan_TSA_04_interedu.docx
@@ -594,41 +594,41 @@
           <w:sz w:val="24"/>
           <w:szCs w:val="24"/>
         </w:rPr>
-        <w:t xml:space="preserve">Góc $(AA', CD)$ bằng [1]. Góc $(A'C', BD)$ bằng [2]. Góc $(AC, DC')$ bằng [3].</w:t>
-      </w:r>
-    </w:p>
-    <w:p>
-      <w:pPr>
-        <w:jc w:val="left"/>
-      </w:pPr>
-      <w:r>
-        <w:rPr>
-          <w:rFonts w:ascii="Times New Roman" w:cs="Times New Roman" w:eastAsia="Times New Roman" w:hAnsi="Times New Roman"/>
-          <w:b w:val="false"/>
-          <w:bCs w:val="false"/>
-          <w:i w:val="false"/>
-          <w:iCs w:val="false"/>
-          <w:sz w:val="24"/>
-          <w:szCs w:val="24"/>
-        </w:rPr>
-        <w:t xml:space="preserve">Danh sách từ kéo thả: [A. $90^{\circ}$] | [B. $90^{\circ}$] | [C. $60^{\circ}$] | [D. $45^{\circ}$] | [E. $30^{\circ}$]</w:t>
-      </w:r>
-    </w:p>
-    <w:p>
-      <w:pPr>
-        <w:jc w:val="left"/>
-      </w:pPr>
-      <w:r>
-        <w:rPr>
-          <w:rFonts w:ascii="Times New Roman" w:cs="Times New Roman" w:eastAsia="Times New Roman" w:hAnsi="Times New Roman"/>
-          <w:b w:val="false"/>
-          <w:bCs w:val="false"/>
-          <w:i w:val="false"/>
-          <w:iCs w:val="false"/>
-          <w:sz w:val="24"/>
-          <w:szCs w:val="24"/>
-        </w:rPr>
-        <w:t xml:space="preserve">Đáp án đúng: [1] - A | [2] - B | [3] - C</w:t>
+        <w:t xml:space="preserve">Góc $(AA', CD)$ bằng $90^{\circ}$. Góc $(A'C', BD)$ bằng [1]. Góc $(AC, DC')$ bằng [2].</w:t>
+      </w:r>
+    </w:p>
+    <w:p>
+      <w:pPr>
+        <w:jc w:val="left"/>
+      </w:pPr>
+      <w:r>
+        <w:rPr>
+          <w:rFonts w:ascii="Times New Roman" w:cs="Times New Roman" w:eastAsia="Times New Roman" w:hAnsi="Times New Roman"/>
+          <w:b w:val="false"/>
+          <w:bCs w:val="false"/>
+          <w:i w:val="false"/>
+          <w:iCs w:val="false"/>
+          <w:sz w:val="24"/>
+          <w:szCs w:val="24"/>
+        </w:rPr>
+        <w:t xml:space="preserve">Danh sách từ kéo thả: [A. $90^{\circ}$] | [B. $60^{\circ}$] | [C. $45^{\circ}$] | [D. $30^{\circ}$]</w:t>
+      </w:r>
+    </w:p>
+    <w:p>
+      <w:pPr>
+        <w:jc w:val="left"/>
+      </w:pPr>
+      <w:r>
+        <w:rPr>
+          <w:rFonts w:ascii="Times New Roman" w:cs="Times New Roman" w:eastAsia="Times New Roman" w:hAnsi="Times New Roman"/>
+          <w:b w:val="false"/>
+          <w:bCs w:val="false"/>
+          <w:i w:val="false"/>
+          <w:iCs w:val="false"/>
+          <w:sz w:val="24"/>
+          <w:szCs w:val="24"/>
+        </w:rPr>
+        <w:t xml:space="preserve">Đáp án đúng: [1] - A | [2] - B</w:t>
       </w:r>
     </w:p>
     <w:p>
@@ -3438,10 +3438,9 @@
         </w:tblBorders>
       </w:tblPr>
       <w:tblGrid>
-        <w:gridCol w:w="2410"/>
-        <w:gridCol w:w="2410"/>
-        <w:gridCol w:w="2410"/>
-        <w:gridCol w:w="2410"/>
+        <w:gridCol w:w="3213"/>
+        <w:gridCol w:w="3213"/>
+        <w:gridCol w:w="3213"/>
       </w:tblGrid>
       <w:tr>
         <w:tc>
@@ -3507,28 +3506,6 @@
                 <w:szCs w:val="24"/>
               </w:rPr>
               <w:t xml:space="preserve">Tần số</w:t>
-            </w:r>
-          </w:p>
-        </w:tc>
-        <w:tc>
-          <w:tcPr>
-            <w:vAlign w:val="center"/>
-          </w:tcPr>
-          <w:p>
-            <w:pPr>
-              <w:jc w:val="center"/>
-            </w:pPr>
-            <w:r>
-              <w:rPr>
-                <w:rFonts w:ascii="Times New Roman" w:cs="Times New Roman" w:eastAsia="Times New Roman" w:hAnsi="Times New Roman"/>
-                <w:b/>
-                <w:bCs/>
-                <w:i w:val="false"/>
-                <w:iCs w:val="false"/>
-                <w:sz w:val="24"/>
-                <w:szCs w:val="24"/>
-              </w:rPr>
-              <w:t xml:space="preserve">Tần số tích lũy</w:t>
             </w:r>
           </w:p>
         </w:tc>
@@ -3600,28 +3577,6 @@
             </w:r>
           </w:p>
         </w:tc>
-        <w:tc>
-          <w:tcPr>
-            <w:vAlign w:val="center"/>
-          </w:tcPr>
-          <w:p>
-            <w:pPr>
-              <w:jc w:val="center"/>
-            </w:pPr>
-            <w:r>
-              <w:rPr>
-                <w:rFonts w:ascii="Times New Roman" w:cs="Times New Roman" w:eastAsia="Times New Roman" w:hAnsi="Times New Roman"/>
-                <w:b w:val="false"/>
-                <w:bCs w:val="false"/>
-                <w:i w:val="false"/>
-                <w:iCs w:val="false"/>
-                <w:sz w:val="24"/>
-                <w:szCs w:val="24"/>
-              </w:rPr>
-              <w:t xml:space="preserve">$3$</w:t>
-            </w:r>
-          </w:p>
-        </w:tc>
       </w:tr>
       <w:tr>
         <w:tc>
@@ -3665,28 +3620,6 @@
                 <w:szCs w:val="24"/>
               </w:rPr>
               <w:t xml:space="preserve">$12$</w:t>
-            </w:r>
-          </w:p>
-        </w:tc>
-        <w:tc>
-          <w:tcPr>
-            <w:vAlign w:val="center"/>
-          </w:tcPr>
-          <w:p>
-            <w:pPr>
-              <w:jc w:val="center"/>
-            </w:pPr>
-            <w:r>
-              <w:rPr>
-                <w:rFonts w:ascii="Times New Roman" w:cs="Times New Roman" w:eastAsia="Times New Roman" w:hAnsi="Times New Roman"/>
-                <w:b w:val="false"/>
-                <w:bCs w:val="false"/>
-                <w:i w:val="false"/>
-                <w:iCs w:val="false"/>
-                <w:sz w:val="24"/>
-                <w:szCs w:val="24"/>
-              </w:rPr>
-              <w:t xml:space="preserve">$9$</w:t>
             </w:r>
           </w:p>
         </w:tc>
@@ -3780,28 +3713,6 @@
             </w:r>
           </w:p>
         </w:tc>
-        <w:tc>
-          <w:tcPr>
-            <w:vAlign w:val="center"/>
-          </w:tcPr>
-          <w:p>
-            <w:pPr>
-              <w:jc w:val="center"/>
-            </w:pPr>
-            <w:r>
-              <w:rPr>
-                <w:rFonts w:ascii="Times New Roman" w:cs="Times New Roman" w:eastAsia="Times New Roman" w:hAnsi="Times New Roman"/>
-                <w:b w:val="false"/>
-                <w:bCs w:val="false"/>
-                <w:i w:val="false"/>
-                <w:iCs w:val="false"/>
-                <w:sz w:val="24"/>
-                <w:szCs w:val="24"/>
-              </w:rPr>
-              <w:t xml:space="preserve">$21$</w:t>
-            </w:r>
-          </w:p>
-        </w:tc>
       </w:tr>
       <w:tr>
         <w:tc>
@@ -3867,28 +3778,6 @@
                 <w:szCs w:val="24"/>
               </w:rPr>
               <w:t xml:space="preserve">$9$</w:t>
-            </w:r>
-          </w:p>
-        </w:tc>
-        <w:tc>
-          <w:tcPr>
-            <w:vAlign w:val="center"/>
-          </w:tcPr>
-          <w:p>
-            <w:pPr>
-              <w:jc w:val="center"/>
-            </w:pPr>
-            <w:r>
-              <w:rPr>
-                <w:rFonts w:ascii="Times New Roman" w:cs="Times New Roman" w:eastAsia="Times New Roman" w:hAnsi="Times New Roman"/>
-                <w:b w:val="false"/>
-                <w:bCs w:val="false"/>
-                <w:i w:val="false"/>
-                <w:iCs w:val="false"/>
-                <w:sz w:val="24"/>
-                <w:szCs w:val="24"/>
-              </w:rPr>
-              <w:t xml:space="preserve">$27$</w:t>
             </w:r>
           </w:p>
         </w:tc>
@@ -3960,28 +3849,6 @@
             </w:r>
           </w:p>
         </w:tc>
-        <w:tc>
-          <w:tcPr>
-            <w:vAlign w:val="center"/>
-          </w:tcPr>
-          <w:p>
-            <w:pPr>
-              <w:jc w:val="center"/>
-            </w:pPr>
-            <w:r>
-              <w:rPr>
-                <w:rFonts w:ascii="Times New Roman" w:cs="Times New Roman" w:eastAsia="Times New Roman" w:hAnsi="Times New Roman"/>
-                <w:b w:val="false"/>
-                <w:bCs w:val="false"/>
-                <w:i w:val="false"/>
-                <w:iCs w:val="false"/>
-                <w:sz w:val="24"/>
-                <w:szCs w:val="24"/>
-              </w:rPr>
-              <w:t xml:space="preserve">$30$</w:t>
-            </w:r>
-          </w:p>
-        </w:tc>
       </w:tr>
       <w:tr>
         <w:tc>
@@ -4047,28 +3914,6 @@
                 <w:szCs w:val="24"/>
               </w:rPr>
               <w:t xml:space="preserve">$n = 30$</w:t>
-            </w:r>
-          </w:p>
-        </w:tc>
-        <w:tc>
-          <w:tcPr>
-            <w:vAlign w:val="center"/>
-          </w:tcPr>
-          <w:p>
-            <w:pPr>
-              <w:jc w:val="center"/>
-            </w:pPr>
-            <w:r>
-              <w:rPr>
-                <w:rFonts w:ascii="Times New Roman" w:cs="Times New Roman" w:eastAsia="Times New Roman" w:hAnsi="Times New Roman"/>
-                <w:b w:val="false"/>
-                <w:bCs w:val="false"/>
-                <w:i w:val="false"/>
-                <w:iCs w:val="false"/>
-                <w:sz w:val="24"/>
-                <w:szCs w:val="24"/>
-              </w:rPr>
-              <w:t xml:space="preserve"/>
             </w:r>
           </w:p>
         </w:tc>

</xml_diff>